<commit_message>
Expand public issue tree with screened hypotheses
</commit_message>
<xml_diff>
--- a/analysis/eda-methodology-and-evidence.docx
+++ b/analysis/eda-methodology-and-evidence.docx
@@ -43,11 +43,8 @@
       <w:r>
         <w:rPr>
           <w:rFonts w:ascii="Calibri" w:hAnsi="Calibri"/>
-          <w:b w:val="0"/>
-          <w:color w:val="263238"/>
-          <w:sz w:val="22"/>
         </w:rPr>
-        <w:t>I used the supplied Metro A shift, booking, and cancellation logs to identify a pilotable reliability problem and to set a starting rule for the anonymized portfolio proposal. The evidence progresses from the full Metro A baseline to booking timing, a timing check that removes repeat-booking histories, and a time-aware HCP-history screen. I retained the analyses that changed the proposal. I excluded the wider exploratory catalog because it did not change the recommendation.</w:t>
+        <w:t>I used the supplied Metro A shift, booking, and cancellation logs to identify a pilotable reliability problem and to set a starting rule for the anonymized portfolio proposal. The evidence progresses from the full Metro A baseline to booking timing, a timing check that removes repeat-booking histories, and a time-aware HCP-history screen. The issue tree preserves the wider hypothesis catalog and records how each branch was handled. This evidence log keeps the analyses that changed the proposal.</w:t>
       </w:r>
     </w:p>
     <w:p>
@@ -205,6 +202,7 @@
       <w:tr>
         <w:trPr>
           <w:tblHeader w:val="true"/>
+          <w:cantSplit/>
         </w:trPr>
         <w:tc>
           <w:tcPr>
@@ -316,6 +314,9 @@
         </w:tc>
       </w:tr>
       <w:tr>
+        <w:trPr>
+          <w:cantSplit/>
+        </w:trPr>
         <w:tc>
           <w:tcPr>
             <w:tcW w:type="dxa" w:w="2340"/>
@@ -426,6 +427,9 @@
         </w:tc>
       </w:tr>
       <w:tr>
+        <w:trPr>
+          <w:cantSplit/>
+        </w:trPr>
         <w:tc>
           <w:tcPr>
             <w:tcW w:type="dxa" w:w="2340"/>
@@ -536,6 +540,9 @@
         </w:tc>
       </w:tr>
       <w:tr>
+        <w:trPr>
+          <w:cantSplit/>
+        </w:trPr>
         <w:tc>
           <w:tcPr>
             <w:tcW w:type="dxa" w:w="2340"/>
@@ -790,6 +797,7 @@
       <w:tr>
         <w:trPr>
           <w:tblHeader w:val="true"/>
+          <w:cantSplit/>
         </w:trPr>
         <w:tc>
           <w:tcPr>
@@ -901,6 +909,9 @@
         </w:tc>
       </w:tr>
       <w:tr>
+        <w:trPr>
+          <w:cantSplit/>
+        </w:trPr>
         <w:tc>
           <w:tcPr>
             <w:tcW w:type="dxa" w:w="2340"/>
@@ -1011,6 +1022,9 @@
         </w:tc>
       </w:tr>
       <w:tr>
+        <w:trPr>
+          <w:cantSplit/>
+        </w:trPr>
         <w:tc>
           <w:tcPr>
             <w:tcW w:type="dxa" w:w="2340"/>
@@ -1121,6 +1135,9 @@
         </w:tc>
       </w:tr>
       <w:tr>
+        <w:trPr>
+          <w:cantSplit/>
+        </w:trPr>
         <w:tc>
           <w:tcPr>
             <w:tcW w:type="dxa" w:w="2340"/>
@@ -1231,6 +1248,9 @@
         </w:tc>
       </w:tr>
       <w:tr>
+        <w:trPr>
+          <w:cantSplit/>
+        </w:trPr>
         <w:tc>
           <w:tcPr>
             <w:tcW w:type="dxa" w:w="2340"/>
@@ -1341,6 +1361,9 @@
         </w:tc>
       </w:tr>
       <w:tr>
+        <w:trPr>
+          <w:cantSplit/>
+        </w:trPr>
         <w:tc>
           <w:tcPr>
             <w:tcW w:type="dxa" w:w="2340"/>
@@ -1512,6 +1535,7 @@
       <w:tr>
         <w:trPr>
           <w:tblHeader w:val="true"/>
+          <w:cantSplit/>
         </w:trPr>
         <w:tc>
           <w:tcPr>
@@ -1623,6 +1647,9 @@
         </w:tc>
       </w:tr>
       <w:tr>
+        <w:trPr>
+          <w:cantSplit/>
+        </w:trPr>
         <w:tc>
           <w:tcPr>
             <w:tcW w:type="dxa" w:w="2340"/>
@@ -1733,6 +1760,9 @@
         </w:tc>
       </w:tr>
       <w:tr>
+        <w:trPr>
+          <w:cantSplit/>
+        </w:trPr>
         <w:tc>
           <w:tcPr>
             <w:tcW w:type="dxa" w:w="2340"/>
@@ -1843,6 +1873,9 @@
         </w:tc>
       </w:tr>
       <w:tr>
+        <w:trPr>
+          <w:cantSplit/>
+        </w:trPr>
         <w:tc>
           <w:tcPr>
             <w:tcW w:type="dxa" w:w="2340"/>
@@ -1953,6 +1986,9 @@
         </w:tc>
       </w:tr>
       <w:tr>
+        <w:trPr>
+          <w:cantSplit/>
+        </w:trPr>
         <w:tc>
           <w:tcPr>
             <w:tcW w:type="dxa" w:w="2340"/>
@@ -2063,6 +2099,9 @@
         </w:tc>
       </w:tr>
       <w:tr>
+        <w:trPr>
+          <w:cantSplit/>
+        </w:trPr>
         <w:tc>
           <w:tcPr>
             <w:tcW w:type="dxa" w:w="2340"/>
@@ -2339,6 +2378,7 @@
       <w:tr>
         <w:trPr>
           <w:tblHeader w:val="true"/>
+          <w:cantSplit/>
         </w:trPr>
         <w:tc>
           <w:tcPr>
@@ -2450,6 +2490,9 @@
         </w:tc>
       </w:tr>
       <w:tr>
+        <w:trPr>
+          <w:cantSplit/>
+        </w:trPr>
         <w:tc>
           <w:tcPr>
             <w:tcW w:type="dxa" w:w="2340"/>
@@ -2560,6 +2603,9 @@
         </w:tc>
       </w:tr>
       <w:tr>
+        <w:trPr>
+          <w:cantSplit/>
+        </w:trPr>
         <w:tc>
           <w:tcPr>
             <w:tcW w:type="dxa" w:w="2340"/>
@@ -2729,6 +2775,7 @@
     <w:p>
       <w:pPr>
         <w:pStyle w:val="Heading2"/>
+        <w:pageBreakBefore/>
       </w:pPr>
       <w:r>
         <w:rPr>
@@ -2806,6 +2853,7 @@
       <w:tr>
         <w:trPr>
           <w:tblHeader w:val="true"/>
+          <w:cantSplit/>
         </w:trPr>
         <w:tc>
           <w:tcPr>
@@ -2944,6 +2992,9 @@
         </w:tc>
       </w:tr>
       <w:tr>
+        <w:trPr>
+          <w:cantSplit/>
+        </w:trPr>
         <w:tc>
           <w:tcPr>
             <w:tcW w:type="dxa" w:w="1872"/>
@@ -3081,6 +3132,9 @@
         </w:tc>
       </w:tr>
       <w:tr>
+        <w:trPr>
+          <w:cantSplit/>
+        </w:trPr>
         <w:tc>
           <w:tcPr>
             <w:tcW w:type="dxa" w:w="1872"/>
@@ -3218,6 +3272,9 @@
         </w:tc>
       </w:tr>
       <w:tr>
+        <w:trPr>
+          <w:cantSplit/>
+        </w:trPr>
         <w:tc>
           <w:tcPr>
             <w:tcW w:type="dxa" w:w="1872"/>
@@ -3441,6 +3498,7 @@
       <w:tr>
         <w:trPr>
           <w:tblHeader w:val="true"/>
+          <w:cantSplit/>
         </w:trPr>
         <w:tc>
           <w:tcPr>
@@ -3552,6 +3610,9 @@
         </w:tc>
       </w:tr>
       <w:tr>
+        <w:trPr>
+          <w:cantSplit/>
+        </w:trPr>
         <w:tc>
           <w:tcPr>
             <w:tcW w:type="dxa" w:w="2340"/>
@@ -3662,6 +3723,9 @@
         </w:tc>
       </w:tr>
       <w:tr>
+        <w:trPr>
+          <w:cantSplit/>
+        </w:trPr>
         <w:tc>
           <w:tcPr>
             <w:tcW w:type="dxa" w:w="2340"/>
@@ -3772,6 +3836,9 @@
         </w:tc>
       </w:tr>
       <w:tr>
+        <w:trPr>
+          <w:cantSplit/>
+        </w:trPr>
         <w:tc>
           <w:tcPr>
             <w:tcW w:type="dxa" w:w="2340"/>
@@ -3882,6 +3949,9 @@
         </w:tc>
       </w:tr>
       <w:tr>
+        <w:trPr>
+          <w:cantSplit/>
+        </w:trPr>
         <w:tc>
           <w:tcPr>
             <w:tcW w:type="dxa" w:w="2340"/>

</xml_diff>